<commit_message>
Update Experiment 04 documentation files
Revised Experiment_04.docx and Experiment_04.pdf in Lab 4. Changes may include content updates, formatting improvements, or corrections to the experiment documentation.
</commit_message>
<xml_diff>
--- a/Programs/Lab Works/Lab 4/Experiment_04.docx
+++ b/Programs/Lab Works/Lab 4/Experiment_04.docx
@@ -881,6 +881,9 @@
         <w:pStyle w:val="ListParagraph"/>
       </w:pPr>
       <w:r>
+        <w:rPr>
+          <w:noProof/>
+        </w:rPr>
         <w:drawing>
           <wp:inline distT="0" distB="0" distL="0" distR="0" wp14:anchorId="230DB952" wp14:editId="74ABDE97">
             <wp:extent cx="5486400" cy="1220470"/>
@@ -897,7 +900,7 @@
                     <pic:cNvPicPr/>
                   </pic:nvPicPr>
                   <pic:blipFill>
-                    <a:blip r:embed="rId6"/>
+                    <a:blip r:embed="rId8"/>
                     <a:stretch>
                       <a:fillRect/>
                     </a:stretch>
@@ -927,6 +930,9 @@
         </w:numPr>
       </w:pPr>
       <w:r>
+        <w:rPr>
+          <w:noProof/>
+        </w:rPr>
         <w:drawing>
           <wp:anchor distT="0" distB="0" distL="114300" distR="114300" simplePos="0" relativeHeight="251658752" behindDoc="1" locked="0" layoutInCell="1" allowOverlap="1" wp14:anchorId="00C43EE5" wp14:editId="34A827B8">
             <wp:simplePos x="0" y="0"/>
@@ -951,7 +957,7 @@
                     <pic:cNvPicPr/>
                   </pic:nvPicPr>
                   <pic:blipFill>
-                    <a:blip r:embed="rId7"/>
+                    <a:blip r:embed="rId9"/>
                     <a:stretch>
                       <a:fillRect/>
                     </a:stretch>
@@ -1062,6 +1068,9 @@
         </w:numPr>
       </w:pPr>
       <w:r>
+        <w:rPr>
+          <w:noProof/>
+        </w:rPr>
         <w:lastRenderedPageBreak/>
         <w:drawing>
           <wp:anchor distT="0" distB="0" distL="114300" distR="114300" simplePos="0" relativeHeight="251660800" behindDoc="1" locked="0" layoutInCell="1" allowOverlap="1" wp14:anchorId="686BFFCA" wp14:editId="280251A7">
@@ -1087,7 +1096,7 @@
                     <pic:cNvPicPr/>
                   </pic:nvPicPr>
                   <pic:blipFill>
-                    <a:blip r:embed="rId8"/>
+                    <a:blip r:embed="rId10"/>
                     <a:stretch>
                       <a:fillRect/>
                     </a:stretch>
@@ -1179,6 +1188,9 @@
     </w:p>
     <w:p>
       <w:r>
+        <w:rPr>
+          <w:noProof/>
+        </w:rPr>
         <w:drawing>
           <wp:inline distT="0" distB="0" distL="0" distR="0" wp14:anchorId="1130F765" wp14:editId="7A711890">
             <wp:extent cx="5486400" cy="3836670"/>
@@ -1195,7 +1207,7 @@
                     <pic:cNvPicPr/>
                   </pic:nvPicPr>
                   <pic:blipFill>
-                    <a:blip r:embed="rId9"/>
+                    <a:blip r:embed="rId11"/>
                     <a:stretch>
                       <a:fillRect/>
                     </a:stretch>
@@ -1236,6 +1248,9 @@
         <w:ind w:left="360"/>
       </w:pPr>
       <w:r>
+        <w:rPr>
+          <w:noProof/>
+        </w:rPr>
         <w:drawing>
           <wp:inline distT="0" distB="0" distL="0" distR="0" wp14:anchorId="012F8D1C" wp14:editId="184529BD">
             <wp:extent cx="4429743" cy="3591426"/>
@@ -1252,7 +1267,7 @@
                     <pic:cNvPicPr/>
                   </pic:nvPicPr>
                   <pic:blipFill>
-                    <a:blip r:embed="rId10"/>
+                    <a:blip r:embed="rId12"/>
                     <a:stretch>
                       <a:fillRect/>
                     </a:stretch>
@@ -1424,6 +1439,12 @@
       </w:pPr>
     </w:p>
     <w:sectPr>
+      <w:headerReference w:type="even" r:id="rId13"/>
+      <w:headerReference w:type="default" r:id="rId14"/>
+      <w:footerReference w:type="even" r:id="rId15"/>
+      <w:footerReference w:type="default" r:id="rId16"/>
+      <w:headerReference w:type="first" r:id="rId17"/>
+      <w:footerReference w:type="first" r:id="rId18"/>
       <w:pgSz w:w="12240" w:h="15840"/>
       <w:pgMar w:top="1440" w:right="1800" w:bottom="1440" w:left="1800" w:header="720" w:footer="720" w:gutter="0"/>
       <w:cols w:space="720"/>
@@ -1431,6 +1452,203 @@
     </w:sectPr>
   </w:body>
 </w:document>
+</file>
+
+<file path=word/endnotes.xml><?xml version="1.0" encoding="utf-8"?>
+<w:endnotes xmlns:wpc="http://schemas.microsoft.com/office/word/2010/wordprocessingCanvas" xmlns:cx="http://schemas.microsoft.com/office/drawing/2014/chartex" xmlns:cx1="http://schemas.microsoft.com/office/drawing/2015/9/8/chartex" xmlns:cx2="http://schemas.microsoft.com/office/drawing/2015/10/21/chartex" xmlns:cx3="http://schemas.microsoft.com/office/drawing/2016/5/9/chartex" xmlns:cx4="http://schemas.microsoft.com/office/drawing/2016/5/10/chartex" xmlns:cx5="http://schemas.microsoft.com/office/drawing/2016/5/11/chartex" xmlns:cx6="http://schemas.microsoft.com/office/drawing/2016/5/12/chartex" xmlns:cx7="http://schemas.microsoft.com/office/drawing/2016/5/13/chartex" xmlns:cx8="http://schemas.microsoft.com/office/drawing/2016/5/14/chartex" xmlns:mc="http://schemas.openxmlformats.org/markup-compatibility/2006" xmlns:aink="http://schemas.microsoft.com/office/drawing/2016/ink" xmlns:am3d="http://schemas.microsoft.com/office/drawing/2017/model3d" xmlns:o="urn:schemas-microsoft-com:office:office" xmlns:oel="http://schemas.microsoft.com/office/2019/extlst" xmlns:r="http://schemas.openxmlformats.org/officeDocument/2006/relationships" xmlns:m="http://schemas.openxmlformats.org/officeDocument/2006/math" xmlns:v="urn:schemas-microsoft-com:vml" xmlns:wp14="http://schemas.microsoft.com/office/word/2010/wordprocessingDrawing" xmlns:wp="http://schemas.openxmlformats.org/drawingml/2006/wordprocessingDrawing" xmlns:w10="urn:schemas-microsoft-com:office:word" xmlns:w="http://schemas.openxmlformats.org/wordprocessingml/2006/main" xmlns:w14="http://schemas.microsoft.com/office/word/2010/wordml" xmlns:w15="http://schemas.microsoft.com/office/word/2012/wordml" xmlns:w16cex="http://schemas.microsoft.com/office/word/2018/wordml/cex" xmlns:w16cid="http://schemas.microsoft.com/office/word/2016/wordml/cid" xmlns:w16="http://schemas.microsoft.com/office/word/2018/wordml" xmlns:w16du="http://schemas.microsoft.com/office/word/2023/wordml/word16du" xmlns:w16sdtdh="http://schemas.microsoft.com/office/word/2020/wordml/sdtdatahash" xmlns:w16sdtfl="http://schemas.microsoft.com/office/word/2024/wordml/sdtformatlock" xmlns:w16se="http://schemas.microsoft.com/office/word/2015/wordml/symex" xmlns:wpg="http://schemas.microsoft.com/office/word/2010/wordprocessingGroup" xmlns:wpi="http://schemas.microsoft.com/office/word/2010/wordprocessingInk" xmlns:wne="http://schemas.microsoft.com/office/word/2006/wordml" xmlns:wps="http://schemas.microsoft.com/office/word/2010/wordprocessingShape" mc:Ignorable="w14 w15 w16se w16cid w16 w16cex w16sdtdh w16sdtfl w16du wp14">
+  <w:endnote w:type="separator" w:id="-1">
+    <w:p>
+      <w:pPr>
+        <w:spacing w:after="0" w:line="240" w:lineRule="auto"/>
+      </w:pPr>
+      <w:r>
+        <w:separator/>
+      </w:r>
+    </w:p>
+  </w:endnote>
+  <w:endnote w:type="continuationSeparator" w:id="0">
+    <w:p>
+      <w:pPr>
+        <w:spacing w:after="0" w:line="240" w:lineRule="auto"/>
+      </w:pPr>
+      <w:r>
+        <w:continuationSeparator/>
+      </w:r>
+    </w:p>
+  </w:endnote>
+</w:endnotes>
+</file>
+
+<file path=word/footer1.xml><?xml version="1.0" encoding="utf-8"?>
+<w:ftr xmlns:wpc="http://schemas.microsoft.com/office/word/2010/wordprocessingCanvas" xmlns:cx="http://schemas.microsoft.com/office/drawing/2014/chartex" xmlns:cx1="http://schemas.microsoft.com/office/drawing/2015/9/8/chartex" xmlns:cx2="http://schemas.microsoft.com/office/drawing/2015/10/21/chartex" xmlns:cx3="http://schemas.microsoft.com/office/drawing/2016/5/9/chartex" xmlns:cx4="http://schemas.microsoft.com/office/drawing/2016/5/10/chartex" xmlns:cx5="http://schemas.microsoft.com/office/drawing/2016/5/11/chartex" xmlns:cx6="http://schemas.microsoft.com/office/drawing/2016/5/12/chartex" xmlns:cx7="http://schemas.microsoft.com/office/drawing/2016/5/13/chartex" xmlns:cx8="http://schemas.microsoft.com/office/drawing/2016/5/14/chartex" xmlns:mc="http://schemas.openxmlformats.org/markup-compatibility/2006" xmlns:aink="http://schemas.microsoft.com/office/drawing/2016/ink" xmlns:am3d="http://schemas.microsoft.com/office/drawing/2017/model3d" xmlns:o="urn:schemas-microsoft-com:office:office" xmlns:oel="http://schemas.microsoft.com/office/2019/extlst" xmlns:r="http://schemas.openxmlformats.org/officeDocument/2006/relationships" xmlns:m="http://schemas.openxmlformats.org/officeDocument/2006/math" xmlns:v="urn:schemas-microsoft-com:vml" xmlns:wp14="http://schemas.microsoft.com/office/word/2010/wordprocessingDrawing" xmlns:wp="http://schemas.openxmlformats.org/drawingml/2006/wordprocessingDrawing" xmlns:w10="urn:schemas-microsoft-com:office:word" xmlns:w="http://schemas.openxmlformats.org/wordprocessingml/2006/main" xmlns:w14="http://schemas.microsoft.com/office/word/2010/wordml" xmlns:w15="http://schemas.microsoft.com/office/word/2012/wordml" xmlns:w16cex="http://schemas.microsoft.com/office/word/2018/wordml/cex" xmlns:w16cid="http://schemas.microsoft.com/office/word/2016/wordml/cid" xmlns:w16="http://schemas.microsoft.com/office/word/2018/wordml" xmlns:w16du="http://schemas.microsoft.com/office/word/2023/wordml/word16du" xmlns:w16sdtdh="http://schemas.microsoft.com/office/word/2020/wordml/sdtdatahash" xmlns:w16sdtfl="http://schemas.microsoft.com/office/word/2024/wordml/sdtformatlock" xmlns:w16se="http://schemas.microsoft.com/office/word/2015/wordml/symex" xmlns:wpg="http://schemas.microsoft.com/office/word/2010/wordprocessingGroup" xmlns:wpi="http://schemas.microsoft.com/office/word/2010/wordprocessingInk" xmlns:wne="http://schemas.microsoft.com/office/word/2006/wordml" xmlns:wps="http://schemas.microsoft.com/office/word/2010/wordprocessingShape" mc:Ignorable="w14 w15 w16se w16cid w16 w16cex w16sdtdh w16sdtfl w16du wp14">
+  <w:p>
+    <w:pPr>
+      <w:pStyle w:val="Footer"/>
+    </w:pPr>
+  </w:p>
+</w:ftr>
+</file>
+
+<file path=word/footer2.xml><?xml version="1.0" encoding="utf-8"?>
+<w:ftr xmlns:wpc="http://schemas.microsoft.com/office/word/2010/wordprocessingCanvas" xmlns:cx="http://schemas.microsoft.com/office/drawing/2014/chartex" xmlns:cx1="http://schemas.microsoft.com/office/drawing/2015/9/8/chartex" xmlns:cx2="http://schemas.microsoft.com/office/drawing/2015/10/21/chartex" xmlns:cx3="http://schemas.microsoft.com/office/drawing/2016/5/9/chartex" xmlns:cx4="http://schemas.microsoft.com/office/drawing/2016/5/10/chartex" xmlns:cx5="http://schemas.microsoft.com/office/drawing/2016/5/11/chartex" xmlns:cx6="http://schemas.microsoft.com/office/drawing/2016/5/12/chartex" xmlns:cx7="http://schemas.microsoft.com/office/drawing/2016/5/13/chartex" xmlns:cx8="http://schemas.microsoft.com/office/drawing/2016/5/14/chartex" xmlns:mc="http://schemas.openxmlformats.org/markup-compatibility/2006" xmlns:aink="http://schemas.microsoft.com/office/drawing/2016/ink" xmlns:am3d="http://schemas.microsoft.com/office/drawing/2017/model3d" xmlns:o="urn:schemas-microsoft-com:office:office" xmlns:oel="http://schemas.microsoft.com/office/2019/extlst" xmlns:r="http://schemas.openxmlformats.org/officeDocument/2006/relationships" xmlns:m="http://schemas.openxmlformats.org/officeDocument/2006/math" xmlns:v="urn:schemas-microsoft-com:vml" xmlns:wp14="http://schemas.microsoft.com/office/word/2010/wordprocessingDrawing" xmlns:wp="http://schemas.openxmlformats.org/drawingml/2006/wordprocessingDrawing" xmlns:w10="urn:schemas-microsoft-com:office:word" xmlns:w="http://schemas.openxmlformats.org/wordprocessingml/2006/main" xmlns:w14="http://schemas.microsoft.com/office/word/2010/wordml" xmlns:w15="http://schemas.microsoft.com/office/word/2012/wordml" xmlns:w16cex="http://schemas.microsoft.com/office/word/2018/wordml/cex" xmlns:w16cid="http://schemas.microsoft.com/office/word/2016/wordml/cid" xmlns:w16="http://schemas.microsoft.com/office/word/2018/wordml" xmlns:w16du="http://schemas.microsoft.com/office/word/2023/wordml/word16du" xmlns:w16sdtdh="http://schemas.microsoft.com/office/word/2020/wordml/sdtdatahash" xmlns:w16sdtfl="http://schemas.microsoft.com/office/word/2024/wordml/sdtformatlock" xmlns:w16se="http://schemas.microsoft.com/office/word/2015/wordml/symex" xmlns:wpg="http://schemas.microsoft.com/office/word/2010/wordprocessingGroup" xmlns:wpi="http://schemas.microsoft.com/office/word/2010/wordprocessingInk" xmlns:wne="http://schemas.microsoft.com/office/word/2006/wordml" xmlns:wps="http://schemas.microsoft.com/office/word/2010/wordprocessingShape" mc:Ignorable="w14 w15 w16se w16cid w16 w16cex w16sdtdh w16sdtfl w16du wp14">
+  <w:p>
+    <w:pPr>
+      <w:pStyle w:val="Footer"/>
+    </w:pPr>
+  </w:p>
+</w:ftr>
+</file>
+
+<file path=word/footer3.xml><?xml version="1.0" encoding="utf-8"?>
+<w:ftr xmlns:wpc="http://schemas.microsoft.com/office/word/2010/wordprocessingCanvas" xmlns:cx="http://schemas.microsoft.com/office/drawing/2014/chartex" xmlns:cx1="http://schemas.microsoft.com/office/drawing/2015/9/8/chartex" xmlns:cx2="http://schemas.microsoft.com/office/drawing/2015/10/21/chartex" xmlns:cx3="http://schemas.microsoft.com/office/drawing/2016/5/9/chartex" xmlns:cx4="http://schemas.microsoft.com/office/drawing/2016/5/10/chartex" xmlns:cx5="http://schemas.microsoft.com/office/drawing/2016/5/11/chartex" xmlns:cx6="http://schemas.microsoft.com/office/drawing/2016/5/12/chartex" xmlns:cx7="http://schemas.microsoft.com/office/drawing/2016/5/13/chartex" xmlns:cx8="http://schemas.microsoft.com/office/drawing/2016/5/14/chartex" xmlns:mc="http://schemas.openxmlformats.org/markup-compatibility/2006" xmlns:aink="http://schemas.microsoft.com/office/drawing/2016/ink" xmlns:am3d="http://schemas.microsoft.com/office/drawing/2017/model3d" xmlns:o="urn:schemas-microsoft-com:office:office" xmlns:oel="http://schemas.microsoft.com/office/2019/extlst" xmlns:r="http://schemas.openxmlformats.org/officeDocument/2006/relationships" xmlns:m="http://schemas.openxmlformats.org/officeDocument/2006/math" xmlns:v="urn:schemas-microsoft-com:vml" xmlns:wp14="http://schemas.microsoft.com/office/word/2010/wordprocessingDrawing" xmlns:wp="http://schemas.openxmlformats.org/drawingml/2006/wordprocessingDrawing" xmlns:w10="urn:schemas-microsoft-com:office:word" xmlns:w="http://schemas.openxmlformats.org/wordprocessingml/2006/main" xmlns:w14="http://schemas.microsoft.com/office/word/2010/wordml" xmlns:w15="http://schemas.microsoft.com/office/word/2012/wordml" xmlns:w16cex="http://schemas.microsoft.com/office/word/2018/wordml/cex" xmlns:w16cid="http://schemas.microsoft.com/office/word/2016/wordml/cid" xmlns:w16="http://schemas.microsoft.com/office/word/2018/wordml" xmlns:w16du="http://schemas.microsoft.com/office/word/2023/wordml/word16du" xmlns:w16sdtdh="http://schemas.microsoft.com/office/word/2020/wordml/sdtdatahash" xmlns:w16sdtfl="http://schemas.microsoft.com/office/word/2024/wordml/sdtformatlock" xmlns:w16se="http://schemas.microsoft.com/office/word/2015/wordml/symex" xmlns:wpg="http://schemas.microsoft.com/office/word/2010/wordprocessingGroup" xmlns:wpi="http://schemas.microsoft.com/office/word/2010/wordprocessingInk" xmlns:wne="http://schemas.microsoft.com/office/word/2006/wordml" xmlns:wps="http://schemas.microsoft.com/office/word/2010/wordprocessingShape" mc:Ignorable="w14 w15 w16se w16cid w16 w16cex w16sdtdh w16sdtfl w16du wp14">
+  <w:p>
+    <w:pPr>
+      <w:pStyle w:val="Footer"/>
+    </w:pPr>
+  </w:p>
+</w:ftr>
+</file>
+
+<file path=word/footnotes.xml><?xml version="1.0" encoding="utf-8"?>
+<w:footnotes xmlns:wpc="http://schemas.microsoft.com/office/word/2010/wordprocessingCanvas" xmlns:cx="http://schemas.microsoft.com/office/drawing/2014/chartex" xmlns:cx1="http://schemas.microsoft.com/office/drawing/2015/9/8/chartex" xmlns:cx2="http://schemas.microsoft.com/office/drawing/2015/10/21/chartex" xmlns:cx3="http://schemas.microsoft.com/office/drawing/2016/5/9/chartex" xmlns:cx4="http://schemas.microsoft.com/office/drawing/2016/5/10/chartex" xmlns:cx5="http://schemas.microsoft.com/office/drawing/2016/5/11/chartex" xmlns:cx6="http://schemas.microsoft.com/office/drawing/2016/5/12/chartex" xmlns:cx7="http://schemas.microsoft.com/office/drawing/2016/5/13/chartex" xmlns:cx8="http://schemas.microsoft.com/office/drawing/2016/5/14/chartex" xmlns:mc="http://schemas.openxmlformats.org/markup-compatibility/2006" xmlns:aink="http://schemas.microsoft.com/office/drawing/2016/ink" xmlns:am3d="http://schemas.microsoft.com/office/drawing/2017/model3d" xmlns:o="urn:schemas-microsoft-com:office:office" xmlns:oel="http://schemas.microsoft.com/office/2019/extlst" xmlns:r="http://schemas.openxmlformats.org/officeDocument/2006/relationships" xmlns:m="http://schemas.openxmlformats.org/officeDocument/2006/math" xmlns:v="urn:schemas-microsoft-com:vml" xmlns:wp14="http://schemas.microsoft.com/office/word/2010/wordprocessingDrawing" xmlns:wp="http://schemas.openxmlformats.org/drawingml/2006/wordprocessingDrawing" xmlns:w10="urn:schemas-microsoft-com:office:word" xmlns:w="http://schemas.openxmlformats.org/wordprocessingml/2006/main" xmlns:w14="http://schemas.microsoft.com/office/word/2010/wordml" xmlns:w15="http://schemas.microsoft.com/office/word/2012/wordml" xmlns:w16cex="http://schemas.microsoft.com/office/word/2018/wordml/cex" xmlns:w16cid="http://schemas.microsoft.com/office/word/2016/wordml/cid" xmlns:w16="http://schemas.microsoft.com/office/word/2018/wordml" xmlns:w16du="http://schemas.microsoft.com/office/word/2023/wordml/word16du" xmlns:w16sdtdh="http://schemas.microsoft.com/office/word/2020/wordml/sdtdatahash" xmlns:w16sdtfl="http://schemas.microsoft.com/office/word/2024/wordml/sdtformatlock" xmlns:w16se="http://schemas.microsoft.com/office/word/2015/wordml/symex" xmlns:wpg="http://schemas.microsoft.com/office/word/2010/wordprocessingGroup" xmlns:wpi="http://schemas.microsoft.com/office/word/2010/wordprocessingInk" xmlns:wne="http://schemas.microsoft.com/office/word/2006/wordml" xmlns:wps="http://schemas.microsoft.com/office/word/2010/wordprocessingShape" mc:Ignorable="w14 w15 w16se w16cid w16 w16cex w16sdtdh w16sdtfl w16du wp14">
+  <w:footnote w:type="separator" w:id="-1">
+    <w:p>
+      <w:pPr>
+        <w:spacing w:after="0" w:line="240" w:lineRule="auto"/>
+      </w:pPr>
+      <w:r>
+        <w:separator/>
+      </w:r>
+    </w:p>
+  </w:footnote>
+  <w:footnote w:type="continuationSeparator" w:id="0">
+    <w:p>
+      <w:pPr>
+        <w:spacing w:after="0" w:line="240" w:lineRule="auto"/>
+      </w:pPr>
+      <w:r>
+        <w:continuationSeparator/>
+      </w:r>
+    </w:p>
+  </w:footnote>
+</w:footnotes>
+</file>
+
+<file path=word/header1.xml><?xml version="1.0" encoding="utf-8"?>
+<w:hdr xmlns:wpc="http://schemas.microsoft.com/office/word/2010/wordprocessingCanvas" xmlns:cx="http://schemas.microsoft.com/office/drawing/2014/chartex" xmlns:cx1="http://schemas.microsoft.com/office/drawing/2015/9/8/chartex" xmlns:cx2="http://schemas.microsoft.com/office/drawing/2015/10/21/chartex" xmlns:cx3="http://schemas.microsoft.com/office/drawing/2016/5/9/chartex" xmlns:cx4="http://schemas.microsoft.com/office/drawing/2016/5/10/chartex" xmlns:cx5="http://schemas.microsoft.com/office/drawing/2016/5/11/chartex" xmlns:cx6="http://schemas.microsoft.com/office/drawing/2016/5/12/chartex" xmlns:cx7="http://schemas.microsoft.com/office/drawing/2016/5/13/chartex" xmlns:cx8="http://schemas.microsoft.com/office/drawing/2016/5/14/chartex" xmlns:mc="http://schemas.openxmlformats.org/markup-compatibility/2006" xmlns:aink="http://schemas.microsoft.com/office/drawing/2016/ink" xmlns:am3d="http://schemas.microsoft.com/office/drawing/2017/model3d" xmlns:o="urn:schemas-microsoft-com:office:office" xmlns:oel="http://schemas.microsoft.com/office/2019/extlst" xmlns:r="http://schemas.openxmlformats.org/officeDocument/2006/relationships" xmlns:m="http://schemas.openxmlformats.org/officeDocument/2006/math" xmlns:v="urn:schemas-microsoft-com:vml" xmlns:wp14="http://schemas.microsoft.com/office/word/2010/wordprocessingDrawing" xmlns:wp="http://schemas.openxmlformats.org/drawingml/2006/wordprocessingDrawing" xmlns:w10="urn:schemas-microsoft-com:office:word" xmlns:w="http://schemas.openxmlformats.org/wordprocessingml/2006/main" xmlns:w14="http://schemas.microsoft.com/office/word/2010/wordml" xmlns:w15="http://schemas.microsoft.com/office/word/2012/wordml" xmlns:w16cex="http://schemas.microsoft.com/office/word/2018/wordml/cex" xmlns:w16cid="http://schemas.microsoft.com/office/word/2016/wordml/cid" xmlns:w16="http://schemas.microsoft.com/office/word/2018/wordml" xmlns:w16du="http://schemas.microsoft.com/office/word/2023/wordml/word16du" xmlns:w16sdtdh="http://schemas.microsoft.com/office/word/2020/wordml/sdtdatahash" xmlns:w16sdtfl="http://schemas.microsoft.com/office/word/2024/wordml/sdtformatlock" xmlns:w16se="http://schemas.microsoft.com/office/word/2015/wordml/symex" xmlns:wpg="http://schemas.microsoft.com/office/word/2010/wordprocessingGroup" xmlns:wpi="http://schemas.microsoft.com/office/word/2010/wordprocessingInk" xmlns:wne="http://schemas.microsoft.com/office/word/2006/wordml" xmlns:wps="http://schemas.microsoft.com/office/word/2010/wordprocessingShape" mc:Ignorable="w14 w15 w16se w16cid w16 w16cex w16sdtdh w16sdtfl w16du wp14">
+  <w:p>
+    <w:pPr>
+      <w:pStyle w:val="Header"/>
+    </w:pPr>
+    <w:r>
+      <w:rPr>
+        <w:noProof/>
+      </w:rPr>
+      <w:pict w14:anchorId="39504EC3">
+        <v:shapetype id="_x0000_t75" coordsize="21600,21600" o:spt="75" o:preferrelative="t" path="m@4@5l@4@11@9@11@9@5xe" filled="f" stroked="f">
+          <v:stroke joinstyle="miter"/>
+          <v:formulas>
+            <v:f eqn="if lineDrawn pixelLineWidth 0"/>
+            <v:f eqn="sum @0 1 0"/>
+            <v:f eqn="sum 0 0 @1"/>
+            <v:f eqn="prod @2 1 2"/>
+            <v:f eqn="prod @3 21600 pixelWidth"/>
+            <v:f eqn="prod @3 21600 pixelHeight"/>
+            <v:f eqn="sum @0 0 1"/>
+            <v:f eqn="prod @6 1 2"/>
+            <v:f eqn="prod @7 21600 pixelWidth"/>
+            <v:f eqn="sum @8 21600 0"/>
+            <v:f eqn="prod @7 21600 pixelHeight"/>
+            <v:f eqn="sum @10 21600 0"/>
+          </v:formulas>
+          <v:path o:extrusionok="f" gradientshapeok="t" o:connecttype="rect"/>
+          <o:lock v:ext="edit" aspectratio="t"/>
+        </v:shapetype>
+        <v:shape id="WordPictureWatermark3107735" o:spid="_x0000_s1026" type="#_x0000_t75" style="position:absolute;margin-left:0;margin-top:0;width:6in;height:6in;z-index:-251657216;mso-position-horizontal:center;mso-position-horizontal-relative:margin;mso-position-vertical:center;mso-position-vertical-relative:margin" o:allowincell="f">
+          <v:imagedata r:id="rId1" o:title="logo2" gain="19661f" blacklevel="22938f"/>
+        </v:shape>
+      </w:pict>
+    </w:r>
+  </w:p>
+</w:hdr>
+</file>
+
+<file path=word/header2.xml><?xml version="1.0" encoding="utf-8"?>
+<w:hdr xmlns:wpc="http://schemas.microsoft.com/office/word/2010/wordprocessingCanvas" xmlns:cx="http://schemas.microsoft.com/office/drawing/2014/chartex" xmlns:cx1="http://schemas.microsoft.com/office/drawing/2015/9/8/chartex" xmlns:cx2="http://schemas.microsoft.com/office/drawing/2015/10/21/chartex" xmlns:cx3="http://schemas.microsoft.com/office/drawing/2016/5/9/chartex" xmlns:cx4="http://schemas.microsoft.com/office/drawing/2016/5/10/chartex" xmlns:cx5="http://schemas.microsoft.com/office/drawing/2016/5/11/chartex" xmlns:cx6="http://schemas.microsoft.com/office/drawing/2016/5/12/chartex" xmlns:cx7="http://schemas.microsoft.com/office/drawing/2016/5/13/chartex" xmlns:cx8="http://schemas.microsoft.com/office/drawing/2016/5/14/chartex" xmlns:mc="http://schemas.openxmlformats.org/markup-compatibility/2006" xmlns:aink="http://schemas.microsoft.com/office/drawing/2016/ink" xmlns:am3d="http://schemas.microsoft.com/office/drawing/2017/model3d" xmlns:o="urn:schemas-microsoft-com:office:office" xmlns:oel="http://schemas.microsoft.com/office/2019/extlst" xmlns:r="http://schemas.openxmlformats.org/officeDocument/2006/relationships" xmlns:m="http://schemas.openxmlformats.org/officeDocument/2006/math" xmlns:v="urn:schemas-microsoft-com:vml" xmlns:wp14="http://schemas.microsoft.com/office/word/2010/wordprocessingDrawing" xmlns:wp="http://schemas.openxmlformats.org/drawingml/2006/wordprocessingDrawing" xmlns:w10="urn:schemas-microsoft-com:office:word" xmlns:w="http://schemas.openxmlformats.org/wordprocessingml/2006/main" xmlns:w14="http://schemas.microsoft.com/office/word/2010/wordml" xmlns:w15="http://schemas.microsoft.com/office/word/2012/wordml" xmlns:w16cex="http://schemas.microsoft.com/office/word/2018/wordml/cex" xmlns:w16cid="http://schemas.microsoft.com/office/word/2016/wordml/cid" xmlns:w16="http://schemas.microsoft.com/office/word/2018/wordml" xmlns:w16du="http://schemas.microsoft.com/office/word/2023/wordml/word16du" xmlns:w16sdtdh="http://schemas.microsoft.com/office/word/2020/wordml/sdtdatahash" xmlns:w16sdtfl="http://schemas.microsoft.com/office/word/2024/wordml/sdtformatlock" xmlns:w16se="http://schemas.microsoft.com/office/word/2015/wordml/symex" xmlns:wpg="http://schemas.microsoft.com/office/word/2010/wordprocessingGroup" xmlns:wpi="http://schemas.microsoft.com/office/word/2010/wordprocessingInk" xmlns:wne="http://schemas.microsoft.com/office/word/2006/wordml" xmlns:wps="http://schemas.microsoft.com/office/word/2010/wordprocessingShape" mc:Ignorable="w14 w15 w16se w16cid w16 w16cex w16sdtdh w16sdtfl w16du wp14">
+  <w:p>
+    <w:pPr>
+      <w:pStyle w:val="Header"/>
+    </w:pPr>
+    <w:r>
+      <w:rPr>
+        <w:noProof/>
+      </w:rPr>
+      <w:pict w14:anchorId="3276FBA1">
+        <v:shapetype id="_x0000_t75" coordsize="21600,21600" o:spt="75" o:preferrelative="t" path="m@4@5l@4@11@9@11@9@5xe" filled="f" stroked="f">
+          <v:stroke joinstyle="miter"/>
+          <v:formulas>
+            <v:f eqn="if lineDrawn pixelLineWidth 0"/>
+            <v:f eqn="sum @0 1 0"/>
+            <v:f eqn="sum 0 0 @1"/>
+            <v:f eqn="prod @2 1 2"/>
+            <v:f eqn="prod @3 21600 pixelWidth"/>
+            <v:f eqn="prod @3 21600 pixelHeight"/>
+            <v:f eqn="sum @0 0 1"/>
+            <v:f eqn="prod @6 1 2"/>
+            <v:f eqn="prod @7 21600 pixelWidth"/>
+            <v:f eqn="sum @8 21600 0"/>
+            <v:f eqn="prod @7 21600 pixelHeight"/>
+            <v:f eqn="sum @10 21600 0"/>
+          </v:formulas>
+          <v:path o:extrusionok="f" gradientshapeok="t" o:connecttype="rect"/>
+          <o:lock v:ext="edit" aspectratio="t"/>
+        </v:shapetype>
+        <v:shape id="WordPictureWatermark3107736" o:spid="_x0000_s1027" type="#_x0000_t75" style="position:absolute;margin-left:0;margin-top:0;width:6in;height:6in;z-index:-251656192;mso-position-horizontal:center;mso-position-horizontal-relative:margin;mso-position-vertical:center;mso-position-vertical-relative:margin" o:allowincell="f">
+          <v:imagedata r:id="rId1" o:title="logo2" gain="19661f" blacklevel="22938f"/>
+        </v:shape>
+      </w:pict>
+    </w:r>
+  </w:p>
+</w:hdr>
+</file>
+
+<file path=word/header3.xml><?xml version="1.0" encoding="utf-8"?>
+<w:hdr xmlns:wpc="http://schemas.microsoft.com/office/word/2010/wordprocessingCanvas" xmlns:cx="http://schemas.microsoft.com/office/drawing/2014/chartex" xmlns:cx1="http://schemas.microsoft.com/office/drawing/2015/9/8/chartex" xmlns:cx2="http://schemas.microsoft.com/office/drawing/2015/10/21/chartex" xmlns:cx3="http://schemas.microsoft.com/office/drawing/2016/5/9/chartex" xmlns:cx4="http://schemas.microsoft.com/office/drawing/2016/5/10/chartex" xmlns:cx5="http://schemas.microsoft.com/office/drawing/2016/5/11/chartex" xmlns:cx6="http://schemas.microsoft.com/office/drawing/2016/5/12/chartex" xmlns:cx7="http://schemas.microsoft.com/office/drawing/2016/5/13/chartex" xmlns:cx8="http://schemas.microsoft.com/office/drawing/2016/5/14/chartex" xmlns:mc="http://schemas.openxmlformats.org/markup-compatibility/2006" xmlns:aink="http://schemas.microsoft.com/office/drawing/2016/ink" xmlns:am3d="http://schemas.microsoft.com/office/drawing/2017/model3d" xmlns:o="urn:schemas-microsoft-com:office:office" xmlns:oel="http://schemas.microsoft.com/office/2019/extlst" xmlns:r="http://schemas.openxmlformats.org/officeDocument/2006/relationships" xmlns:m="http://schemas.openxmlformats.org/officeDocument/2006/math" xmlns:v="urn:schemas-microsoft-com:vml" xmlns:wp14="http://schemas.microsoft.com/office/word/2010/wordprocessingDrawing" xmlns:wp="http://schemas.openxmlformats.org/drawingml/2006/wordprocessingDrawing" xmlns:w10="urn:schemas-microsoft-com:office:word" xmlns:w="http://schemas.openxmlformats.org/wordprocessingml/2006/main" xmlns:w14="http://schemas.microsoft.com/office/word/2010/wordml" xmlns:w15="http://schemas.microsoft.com/office/word/2012/wordml" xmlns:w16cex="http://schemas.microsoft.com/office/word/2018/wordml/cex" xmlns:w16cid="http://schemas.microsoft.com/office/word/2016/wordml/cid" xmlns:w16="http://schemas.microsoft.com/office/word/2018/wordml" xmlns:w16du="http://schemas.microsoft.com/office/word/2023/wordml/word16du" xmlns:w16sdtdh="http://schemas.microsoft.com/office/word/2020/wordml/sdtdatahash" xmlns:w16sdtfl="http://schemas.microsoft.com/office/word/2024/wordml/sdtformatlock" xmlns:w16se="http://schemas.microsoft.com/office/word/2015/wordml/symex" xmlns:wpg="http://schemas.microsoft.com/office/word/2010/wordprocessingGroup" xmlns:wpi="http://schemas.microsoft.com/office/word/2010/wordprocessingInk" xmlns:wne="http://schemas.microsoft.com/office/word/2006/wordml" xmlns:wps="http://schemas.microsoft.com/office/word/2010/wordprocessingShape" mc:Ignorable="w14 w15 w16se w16cid w16 w16cex w16sdtdh w16sdtfl w16du wp14">
+  <w:p>
+    <w:pPr>
+      <w:pStyle w:val="Header"/>
+    </w:pPr>
+    <w:r>
+      <w:rPr>
+        <w:noProof/>
+      </w:rPr>
+      <w:pict w14:anchorId="2A3B903B">
+        <v:shapetype id="_x0000_t75" coordsize="21600,21600" o:spt="75" o:preferrelative="t" path="m@4@5l@4@11@9@11@9@5xe" filled="f" stroked="f">
+          <v:stroke joinstyle="miter"/>
+          <v:formulas>
+            <v:f eqn="if lineDrawn pixelLineWidth 0"/>
+            <v:f eqn="sum @0 1 0"/>
+            <v:f eqn="sum 0 0 @1"/>
+            <v:f eqn="prod @2 1 2"/>
+            <v:f eqn="prod @3 21600 pixelWidth"/>
+            <v:f eqn="prod @3 21600 pixelHeight"/>
+            <v:f eqn="sum @0 0 1"/>
+            <v:f eqn="prod @6 1 2"/>
+            <v:f eqn="prod @7 21600 pixelWidth"/>
+            <v:f eqn="sum @8 21600 0"/>
+            <v:f eqn="prod @7 21600 pixelHeight"/>
+            <v:f eqn="sum @10 21600 0"/>
+          </v:formulas>
+          <v:path o:extrusionok="f" gradientshapeok="t" o:connecttype="rect"/>
+          <o:lock v:ext="edit" aspectratio="t"/>
+        </v:shapetype>
+        <v:shape id="WordPictureWatermark3107734" o:spid="_x0000_s1025" type="#_x0000_t75" style="position:absolute;margin-left:0;margin-top:0;width:6in;height:6in;z-index:-251658240;mso-position-horizontal:center;mso-position-horizontal-relative:margin;mso-position-vertical:center;mso-position-vertical-relative:margin" o:allowincell="f">
+          <v:imagedata r:id="rId1" o:title="logo2" gain="19661f" blacklevel="22938f"/>
+        </v:shape>
+      </w:pict>
+    </w:r>
+  </w:p>
+</w:hdr>
 </file>
 
 <file path=word/numbering.xml><?xml version="1.0" encoding="utf-8"?>

</xml_diff>

<commit_message>
Update Lab 4 and Lab 5 experiment documents
Updated Experiment_04 and Experiment_05 DOCX and PDF files in Lab 4 and Lab 5 directories. Added a temporary file ~$periment_05.docx to Lab 5.
</commit_message>
<xml_diff>
--- a/Programs/Lab Works/Lab 4/Experiment_04.docx
+++ b/Programs/Lab Works/Lab 4/Experiment_04.docx
@@ -590,53 +590,6 @@
           <w:szCs w:val="24"/>
         </w:rPr>
         <w:br/>
-        <w:t># Scatter plot: Number of Rooms (rm) vs House Price (medv)</w:t>
-      </w:r>
-      <w:r>
-        <w:rPr>
-          <w:sz w:val="24"/>
-          <w:szCs w:val="24"/>
-        </w:rPr>
-        <w:br/>
-        <w:t>plt.figure(figsize=(10,8))</w:t>
-      </w:r>
-      <w:r>
-        <w:rPr>
-          <w:sz w:val="24"/>
-          <w:szCs w:val="24"/>
-        </w:rPr>
-        <w:br/>
-        <w:t>sns.scatterplot(data=df, x="rm", y="medv", color="red")</w:t>
-      </w:r>
-      <w:r>
-        <w:rPr>
-          <w:sz w:val="24"/>
-          <w:szCs w:val="24"/>
-        </w:rPr>
-        <w:br/>
-        <w:t>plt.title("Number of Rooms vs Price of House")</w:t>
-      </w:r>
-      <w:r>
-        <w:rPr>
-          <w:sz w:val="24"/>
-          <w:szCs w:val="24"/>
-        </w:rPr>
-        <w:br/>
-        <w:t>plt.show()</w:t>
-      </w:r>
-      <w:r>
-        <w:rPr>
-          <w:sz w:val="24"/>
-          <w:szCs w:val="24"/>
-        </w:rPr>
-        <w:br/>
-      </w:r>
-      <w:r>
-        <w:rPr>
-          <w:sz w:val="24"/>
-          <w:szCs w:val="24"/>
-        </w:rPr>
-        <w:br/>
         <w:t># Selecting features and target</w:t>
       </w:r>
       <w:r>
@@ -744,7 +697,6 @@
           <w:sz w:val="24"/>
           <w:szCs w:val="24"/>
         </w:rPr>
-        <w:lastRenderedPageBreak/>
         <w:br/>
         <w:t># Mean Absolute Error</w:t>
       </w:r>
@@ -771,11 +723,20 @@
         </w:rPr>
         <w:br/>
       </w:r>
+    </w:p>
+    <w:p>
+      <w:pPr>
+        <w:rPr>
+          <w:sz w:val="24"/>
+          <w:szCs w:val="24"/>
+        </w:rPr>
+      </w:pPr>
       <w:r>
         <w:rPr>
           <w:sz w:val="24"/>
           <w:szCs w:val="24"/>
         </w:rPr>
+        <w:lastRenderedPageBreak/>
         <w:br/>
         <w:t># Plot Actual vs Predicted values</w:t>
       </w:r>
@@ -921,157 +882,17 @@
         </w:drawing>
       </w:r>
     </w:p>
+    <w:p/>
     <w:p>
       <w:pPr>
         <w:pStyle w:val="ListParagraph"/>
-        <w:numPr>
-          <w:ilvl w:val="0"/>
-          <w:numId w:val="11"/>
-        </w:numPr>
-      </w:pPr>
+      </w:pPr>
+    </w:p>
+    <w:p>
       <w:r>
         <w:rPr>
           <w:noProof/>
         </w:rPr>
-        <w:drawing>
-          <wp:anchor distT="0" distB="0" distL="114300" distR="114300" simplePos="0" relativeHeight="251658752" behindDoc="1" locked="0" layoutInCell="1" allowOverlap="1" wp14:anchorId="00C43EE5" wp14:editId="34A827B8">
-            <wp:simplePos x="0" y="0"/>
-            <wp:positionH relativeFrom="column">
-              <wp:posOffset>371475</wp:posOffset>
-            </wp:positionH>
-            <wp:positionV relativeFrom="paragraph">
-              <wp:posOffset>110490</wp:posOffset>
-            </wp:positionV>
-            <wp:extent cx="4171950" cy="3460076"/>
-            <wp:effectExtent l="0" t="0" r="0" b="7620"/>
-            <wp:wrapNone/>
-            <wp:docPr id="1938497582" name="Picture 1"/>
-            <wp:cNvGraphicFramePr>
-              <a:graphicFrameLocks xmlns:a="http://schemas.openxmlformats.org/drawingml/2006/main" noChangeAspect="1"/>
-            </wp:cNvGraphicFramePr>
-            <a:graphic xmlns:a="http://schemas.openxmlformats.org/drawingml/2006/main">
-              <a:graphicData uri="http://schemas.openxmlformats.org/drawingml/2006/picture">
-                <pic:pic xmlns:pic="http://schemas.openxmlformats.org/drawingml/2006/picture">
-                  <pic:nvPicPr>
-                    <pic:cNvPr id="1938497582" name=""/>
-                    <pic:cNvPicPr/>
-                  </pic:nvPicPr>
-                  <pic:blipFill>
-                    <a:blip r:embed="rId9"/>
-                    <a:stretch>
-                      <a:fillRect/>
-                    </a:stretch>
-                  </pic:blipFill>
-                  <pic:spPr>
-                    <a:xfrm>
-                      <a:off x="0" y="0"/>
-                      <a:ext cx="4171950" cy="3460076"/>
-                    </a:xfrm>
-                    <a:prstGeom prst="rect">
-                      <a:avLst/>
-                    </a:prstGeom>
-                  </pic:spPr>
-                </pic:pic>
-              </a:graphicData>
-            </a:graphic>
-            <wp14:sizeRelH relativeFrom="margin">
-              <wp14:pctWidth>0</wp14:pctWidth>
-            </wp14:sizeRelH>
-            <wp14:sizeRelV relativeFrom="margin">
-              <wp14:pctHeight>0</wp14:pctHeight>
-            </wp14:sizeRelV>
-          </wp:anchor>
-        </w:drawing>
-      </w:r>
-    </w:p>
-    <w:p>
-      <w:pPr>
-        <w:pStyle w:val="ListParagraph"/>
-      </w:pPr>
-    </w:p>
-    <w:p>
-      <w:pPr>
-        <w:pStyle w:val="ListParagraph"/>
-      </w:pPr>
-    </w:p>
-    <w:p>
-      <w:pPr>
-        <w:pStyle w:val="ListParagraph"/>
-      </w:pPr>
-    </w:p>
-    <w:p>
-      <w:pPr>
-        <w:pStyle w:val="ListParagraph"/>
-      </w:pPr>
-    </w:p>
-    <w:p>
-      <w:pPr>
-        <w:pStyle w:val="ListParagraph"/>
-      </w:pPr>
-    </w:p>
-    <w:p>
-      <w:pPr>
-        <w:pStyle w:val="ListParagraph"/>
-      </w:pPr>
-    </w:p>
-    <w:p>
-      <w:pPr>
-        <w:pStyle w:val="ListParagraph"/>
-      </w:pPr>
-    </w:p>
-    <w:p>
-      <w:pPr>
-        <w:pStyle w:val="ListParagraph"/>
-      </w:pPr>
-    </w:p>
-    <w:p>
-      <w:pPr>
-        <w:pStyle w:val="ListParagraph"/>
-      </w:pPr>
-    </w:p>
-    <w:p>
-      <w:pPr>
-        <w:pStyle w:val="ListParagraph"/>
-      </w:pPr>
-    </w:p>
-    <w:p>
-      <w:pPr>
-        <w:pStyle w:val="ListParagraph"/>
-      </w:pPr>
-    </w:p>
-    <w:p>
-      <w:pPr>
-        <w:pStyle w:val="ListParagraph"/>
-      </w:pPr>
-    </w:p>
-    <w:p>
-      <w:pPr>
-        <w:pStyle w:val="ListParagraph"/>
-      </w:pPr>
-    </w:p>
-    <w:p>
-      <w:pPr>
-        <w:pStyle w:val="ListParagraph"/>
-      </w:pPr>
-    </w:p>
-    <w:p>
-      <w:pPr>
-        <w:pStyle w:val="ListParagraph"/>
-      </w:pPr>
-    </w:p>
-    <w:p>
-      <w:pPr>
-        <w:pStyle w:val="ListParagraph"/>
-        <w:numPr>
-          <w:ilvl w:val="0"/>
-          <w:numId w:val="11"/>
-        </w:numPr>
-      </w:pPr>
-      <w:r>
-        <w:rPr>
-          <w:noProof/>
-        </w:rPr>
-        <w:lastRenderedPageBreak/>
         <w:drawing>
           <wp:anchor distT="0" distB="0" distL="114300" distR="114300" simplePos="0" relativeHeight="251660800" behindDoc="1" locked="0" layoutInCell="1" allowOverlap="1" wp14:anchorId="686BFFCA" wp14:editId="280251A7">
             <wp:simplePos x="0" y="0"/>
@@ -1096,7 +917,7 @@
                     <pic:cNvPicPr/>
                   </pic:nvPicPr>
                   <pic:blipFill>
-                    <a:blip r:embed="rId10"/>
+                    <a:blip r:embed="rId9"/>
                     <a:stretch>
                       <a:fillRect/>
                     </a:stretch>
@@ -1116,6 +937,9 @@
           </wp:anchor>
         </w:drawing>
       </w:r>
+      <w:r>
+        <w:t>2.</w:t>
+      </w:r>
     </w:p>
     <w:p>
       <w:pPr>
@@ -1167,24 +991,14 @@
         <w:pStyle w:val="ListParagraph"/>
       </w:pPr>
     </w:p>
+    <w:p/>
+    <w:p/>
+    <w:p/>
     <w:p>
-      <w:pPr>
-        <w:pStyle w:val="ListParagraph"/>
-      </w:pPr>
-    </w:p>
-    <w:p>
-      <w:pPr>
-        <w:pStyle w:val="ListParagraph"/>
-      </w:pPr>
-    </w:p>
-    <w:p>
-      <w:pPr>
-        <w:pStyle w:val="ListParagraph"/>
-        <w:numPr>
-          <w:ilvl w:val="0"/>
-          <w:numId w:val="11"/>
-        </w:numPr>
-      </w:pPr>
+      <w:r>
+        <w:lastRenderedPageBreak/>
+        <w:t>3.</w:t>
+      </w:r>
     </w:p>
     <w:p>
       <w:r>
@@ -1192,7 +1006,7 @@
           <w:noProof/>
         </w:rPr>
         <w:drawing>
-          <wp:inline distT="0" distB="0" distL="0" distR="0" wp14:anchorId="1130F765" wp14:editId="7A711890">
+          <wp:inline distT="0" distB="0" distL="0" distR="0" wp14:anchorId="1130F765" wp14:editId="44FF3918">
             <wp:extent cx="5486400" cy="3836670"/>
             <wp:effectExtent l="0" t="0" r="0" b="0"/>
             <wp:docPr id="1472225585" name="Picture 1"/>
@@ -1207,7 +1021,7 @@
                     <pic:cNvPicPr/>
                   </pic:nvPicPr>
                   <pic:blipFill>
-                    <a:blip r:embed="rId11"/>
+                    <a:blip r:embed="rId10"/>
                     <a:stretch>
                       <a:fillRect/>
                     </a:stretch>
@@ -1229,32 +1043,23 @@
       </w:r>
     </w:p>
     <w:p/>
-    <w:p/>
-    <w:p/>
-    <w:p/>
-    <w:p/>
     <w:p>
-      <w:pPr>
-        <w:pStyle w:val="ListParagraph"/>
-        <w:numPr>
-          <w:ilvl w:val="0"/>
-          <w:numId w:val="11"/>
-        </w:numPr>
-      </w:pPr>
-    </w:p>
-    <w:p>
-      <w:pPr>
-        <w:pStyle w:val="ListParagraph"/>
-        <w:ind w:left="360"/>
-      </w:pPr>
       <w:r>
         <w:rPr>
           <w:noProof/>
         </w:rPr>
         <w:drawing>
-          <wp:inline distT="0" distB="0" distL="0" distR="0" wp14:anchorId="012F8D1C" wp14:editId="184529BD">
-            <wp:extent cx="4429743" cy="3591426"/>
+          <wp:anchor distT="0" distB="0" distL="114300" distR="114300" simplePos="0" relativeHeight="251661824" behindDoc="1" locked="0" layoutInCell="1" allowOverlap="1" wp14:anchorId="76FDA950" wp14:editId="68A65143">
+            <wp:simplePos x="0" y="0"/>
+            <wp:positionH relativeFrom="column">
+              <wp:posOffset>304800</wp:posOffset>
+            </wp:positionH>
+            <wp:positionV relativeFrom="paragraph">
+              <wp:posOffset>219710</wp:posOffset>
+            </wp:positionV>
+            <wp:extent cx="4429125" cy="3590925"/>
             <wp:effectExtent l="0" t="0" r="9525" b="9525"/>
+            <wp:wrapNone/>
             <wp:docPr id="92548431" name="Picture 1"/>
             <wp:cNvGraphicFramePr>
               <a:graphicFrameLocks xmlns:a="http://schemas.openxmlformats.org/drawingml/2006/main" noChangeAspect="1"/>
@@ -1267,7 +1072,7 @@
                     <pic:cNvPicPr/>
                   </pic:nvPicPr>
                   <pic:blipFill>
-                    <a:blip r:embed="rId12"/>
+                    <a:blip r:embed="rId11"/>
                     <a:stretch>
                       <a:fillRect/>
                     </a:stretch>
@@ -1275,7 +1080,7 @@
                   <pic:spPr>
                     <a:xfrm>
                       <a:off x="0" y="0"/>
-                      <a:ext cx="4429743" cy="3591426"/>
+                      <a:ext cx="4429125" cy="3590925"/>
                     </a:xfrm>
                     <a:prstGeom prst="rect">
                       <a:avLst/>
@@ -1284,9 +1089,80 @@
                 </pic:pic>
               </a:graphicData>
             </a:graphic>
-          </wp:inline>
+          </wp:anchor>
         </w:drawing>
       </w:r>
+    </w:p>
+    <w:p>
+      <w:r>
+        <w:t xml:space="preserve">4. </w:t>
+      </w:r>
+    </w:p>
+    <w:p>
+      <w:pPr>
+        <w:pStyle w:val="ListParagraph"/>
+        <w:ind w:left="360"/>
+      </w:pPr>
+    </w:p>
+    <w:p>
+      <w:pPr>
+        <w:pStyle w:val="ListParagraph"/>
+        <w:ind w:left="360"/>
+      </w:pPr>
+    </w:p>
+    <w:p>
+      <w:pPr>
+        <w:pStyle w:val="ListParagraph"/>
+        <w:ind w:left="360"/>
+      </w:pPr>
+    </w:p>
+    <w:p>
+      <w:pPr>
+        <w:pStyle w:val="ListParagraph"/>
+        <w:ind w:left="360"/>
+      </w:pPr>
+    </w:p>
+    <w:p>
+      <w:pPr>
+        <w:pStyle w:val="ListParagraph"/>
+        <w:ind w:left="360"/>
+      </w:pPr>
+    </w:p>
+    <w:p>
+      <w:pPr>
+        <w:pStyle w:val="ListParagraph"/>
+        <w:ind w:left="360"/>
+      </w:pPr>
+    </w:p>
+    <w:p>
+      <w:pPr>
+        <w:pStyle w:val="ListParagraph"/>
+        <w:ind w:left="360"/>
+      </w:pPr>
+    </w:p>
+    <w:p>
+      <w:pPr>
+        <w:pStyle w:val="ListParagraph"/>
+        <w:ind w:left="360"/>
+      </w:pPr>
+    </w:p>
+    <w:p>
+      <w:pPr>
+        <w:pStyle w:val="ListParagraph"/>
+        <w:ind w:left="360"/>
+      </w:pPr>
+    </w:p>
+    <w:p>
+      <w:pPr>
+        <w:pStyle w:val="ListParagraph"/>
+        <w:ind w:left="360"/>
+      </w:pPr>
+    </w:p>
+    <w:p>
+      <w:pPr>
+        <w:pStyle w:val="ListParagraph"/>
+        <w:ind w:left="360"/>
+      </w:pPr>
     </w:p>
     <w:p>
       <w:pPr>
@@ -1301,6 +1177,7 @@
           <w:sz w:val="24"/>
           <w:szCs w:val="24"/>
         </w:rPr>
+        <w:lastRenderedPageBreak/>
         <w:t>Observations:</w:t>
       </w:r>
     </w:p>
@@ -1439,12 +1316,12 @@
       </w:pPr>
     </w:p>
     <w:sectPr>
-      <w:headerReference w:type="even" r:id="rId13"/>
-      <w:headerReference w:type="default" r:id="rId14"/>
-      <w:footerReference w:type="even" r:id="rId15"/>
-      <w:footerReference w:type="default" r:id="rId16"/>
-      <w:headerReference w:type="first" r:id="rId17"/>
-      <w:footerReference w:type="first" r:id="rId18"/>
+      <w:headerReference w:type="even" r:id="rId12"/>
+      <w:headerReference w:type="default" r:id="rId13"/>
+      <w:footerReference w:type="even" r:id="rId14"/>
+      <w:footerReference w:type="default" r:id="rId15"/>
+      <w:headerReference w:type="first" r:id="rId16"/>
+      <w:footerReference w:type="first" r:id="rId17"/>
       <w:pgSz w:w="12240" w:h="15840"/>
       <w:pgMar w:top="1440" w:right="1800" w:bottom="1440" w:left="1800" w:header="720" w:footer="720" w:gutter="0"/>
       <w:cols w:space="720"/>
@@ -1566,6 +1443,7 @@
         </v:shapetype>
         <v:shape id="WordPictureWatermark3107735" o:spid="_x0000_s1026" type="#_x0000_t75" style="position:absolute;margin-left:0;margin-top:0;width:6in;height:6in;z-index:-251657216;mso-position-horizontal:center;mso-position-horizontal-relative:margin;mso-position-vertical:center;mso-position-vertical-relative:margin" o:allowincell="f">
           <v:imagedata r:id="rId1" o:title="logo2" gain="19661f" blacklevel="22938f"/>
+          <w10:wrap anchorx="margin" anchory="margin"/>
         </v:shape>
       </w:pict>
     </w:r>
@@ -1605,6 +1483,7 @@
         </v:shapetype>
         <v:shape id="WordPictureWatermark3107736" o:spid="_x0000_s1027" type="#_x0000_t75" style="position:absolute;margin-left:0;margin-top:0;width:6in;height:6in;z-index:-251656192;mso-position-horizontal:center;mso-position-horizontal-relative:margin;mso-position-vertical:center;mso-position-vertical-relative:margin" o:allowincell="f">
           <v:imagedata r:id="rId1" o:title="logo2" gain="19661f" blacklevel="22938f"/>
+          <w10:wrap anchorx="margin" anchory="margin"/>
         </v:shape>
       </w:pict>
     </w:r>
@@ -1644,6 +1523,7 @@
         </v:shapetype>
         <v:shape id="WordPictureWatermark3107734" o:spid="_x0000_s1025" type="#_x0000_t75" style="position:absolute;margin-left:0;margin-top:0;width:6in;height:6in;z-index:-251658240;mso-position-horizontal:center;mso-position-horizontal-relative:margin;mso-position-vertical:center;mso-position-vertical-relative:margin" o:allowincell="f">
           <v:imagedata r:id="rId1" o:title="logo2" gain="19661f" blacklevel="22938f"/>
+          <w10:wrap anchorx="margin" anchory="margin"/>
         </v:shape>
       </w:pict>
     </w:r>

</xml_diff>